<commit_message>
report and slides done
</commit_message>
<xml_diff>
--- a/Delivery 2 A_B_testing/Deliverables/Report_Final.docx
+++ b/Delivery 2 A_B_testing/Deliverables/Report_Final.docx
@@ -75,7 +75,13 @@
           <w:sz w:val="24"/>
         </w:rPr>
         <w:br/>
-        <w:t>December 2024</w:t>
+        <w:t xml:space="preserve">December </w:t>
+      </w:r>
+      <w:r>
+        <w:rPr>
+          <w:sz w:val="24"/>
+        </w:rPr>
+        <w:t>2025</w:t>
       </w:r>
     </w:p>
     <w:p>

</xml_diff>